<commit_message>
UI mobile optimization, album data sync, and scattered album gallery implementation
</commit_message>
<xml_diff>
--- a/测测歌吧.docx
+++ b/测测歌吧.docx
@@ -871,7 +871,7 @@
       <w:pPr>
         <w:spacing w:after="100" w:afterAutospacing="1"/>
         <w:rPr>
-          <w:rFonts w:ascii="Arial" w:hAnsi="Arial" w:cs="Arial" w:hint="eastAsia"/>
+          <w:rFonts w:ascii="Arial" w:hAnsi="Arial" w:cs="Arial"/>
         </w:rPr>
       </w:pPr>
     </w:p>
@@ -1259,7 +1259,7 @@
         </w:numPr>
         <w:spacing w:after="100" w:afterAutospacing="1"/>
         <w:rPr>
-          <w:rFonts w:ascii="Arial" w:hAnsi="Arial" w:cs="Arial"/>
+          <w:rFonts w:ascii="Arial" w:hAnsi="Arial" w:cs="Arial" w:hint="eastAsia"/>
         </w:rPr>
       </w:pPr>
       <w:r>
@@ -1282,6 +1282,18 @@
           <w:rFonts w:ascii="Arial" w:hAnsi="Arial" w:cs="Arial"/>
         </w:rPr>
         <w:t>B + B</w:t>
+      </w:r>
+      <w:r>
+        <w:rPr>
+          <w:rFonts w:ascii="Arial" w:hAnsi="Arial" w:cs="Arial" w:hint="eastAsia"/>
+        </w:rPr>
+        <w:t>或</w:t>
+      </w:r>
+      <w:r>
+        <w:rPr>
+          <w:rFonts w:ascii="Arial" w:hAnsi="Arial" w:cs="Arial" w:hint="eastAsia"/>
+        </w:rPr>
+        <w:t>A+B</w:t>
       </w:r>
     </w:p>
     <w:p>
@@ -1447,7 +1459,7 @@
           <w:noProof/>
           <w14:ligatures w14:val="standardContextual"/>
         </w:rPr>
-        <w:pict w14:anchorId="5C517A6A">
+        <w:pict w14:anchorId="0912632D">
           <v:rect id="_x0000_i1026" alt="" style="width:415.3pt;height:.05pt;mso-width-percent:0;mso-height-percent:0;mso-width-percent:0;mso-height-percent:0" o:hralign="center" o:hrstd="t" o:hr="t" fillcolor="#a0a0a0" stroked="f"/>
         </w:pict>
       </w:r>
@@ -2069,6 +2081,18 @@
         </w:rPr>
         <w:t>）</w:t>
       </w:r>
+    </w:p>
+    <w:p>
+      <w:pPr>
+        <w:numPr>
+          <w:ilvl w:val="1"/>
+          <w:numId w:val="16"/>
+        </w:numPr>
+        <w:spacing w:after="100" w:afterAutospacing="1"/>
+        <w:rPr>
+          <w:rFonts w:ascii="Arial" w:hAnsi="Arial" w:cs="Arial"/>
+        </w:rPr>
+      </w:pPr>
     </w:p>
     <w:p>
       <w:pPr>
@@ -5376,7 +5400,7 @@
           <w:color w:val="1F1F1F"/>
           <w14:ligatures w14:val="standardContextual"/>
         </w:rPr>
-        <w:pict w14:anchorId="44CFB3DC">
+        <w:pict w14:anchorId="2197F86A">
           <v:rect id="_x0000_i1025" alt="" style="width:415.3pt;height:.05pt;mso-width-percent:0;mso-height-percent:0;mso-width-percent:0;mso-height-percent:0" o:hralign="center" o:hrstd="t" o:hrnoshade="t" o:hr="t" fillcolor="gray" stroked="f"/>
         </w:pict>
       </w:r>
@@ -6110,7 +6134,7 @@
           <w:numId w:val="28"/>
         </w:numPr>
         <w:rPr>
-          <w:rFonts w:ascii="Arial" w:hAnsi="Arial" w:cs="Arial" w:hint="eastAsia"/>
+          <w:rFonts w:ascii="Arial" w:hAnsi="Arial" w:cs="Arial"/>
           <w:color w:val="1F1F1F"/>
         </w:rPr>
       </w:pPr>
@@ -6684,7 +6708,7 @@
         <w:spacing w:before="0" w:beforeAutospacing="0" w:after="150" w:afterAutospacing="0"/>
         <w:ind w:left="720"/>
         <w:rPr>
-          <w:rFonts w:ascii="Arial" w:hAnsi="Arial" w:cs="Arial" w:hint="eastAsia"/>
+          <w:rFonts w:ascii="Arial" w:hAnsi="Arial" w:cs="Arial"/>
           <w:color w:val="1F1F1F"/>
         </w:rPr>
       </w:pPr>
@@ -6729,7 +6753,7 @@
         <w:spacing w:after="120"/>
         <w:outlineLvl w:val="2"/>
         <w:rPr>
-          <w:rFonts w:ascii="Arial" w:hAnsi="Arial" w:cs="Arial" w:hint="eastAsia"/>
+          <w:rFonts w:ascii="Arial" w:hAnsi="Arial" w:cs="Arial"/>
           <w:b/>
           <w:bCs/>
           <w:color w:val="1F1F1F"/>
@@ -7306,6 +7330,89 @@
     </w:p>
     <w:p>
       <w:pPr>
+        <w:numPr>
+          <w:ilvl w:val="0"/>
+          <w:numId w:val="46"/>
+        </w:numPr>
+        <w:spacing w:before="100" w:beforeAutospacing="1" w:after="100" w:afterAutospacing="1"/>
+        <w:rPr>
+          <w:rFonts w:ascii="Arial" w:hAnsi="Arial" w:cs="Arial"/>
+          <w:sz w:val="21"/>
+          <w:szCs w:val="21"/>
+        </w:rPr>
+      </w:pPr>
+      <w:r>
+        <w:rPr>
+          <w:rStyle w:val="af"/>
+          <w:rFonts w:ascii="Arial" w:hAnsi="Arial" w:cs="Arial"/>
+          <w:sz w:val="21"/>
+          <w:szCs w:val="21"/>
+        </w:rPr>
+        <w:t>《我要的幸福》：</w:t>
+      </w:r>
+      <w:r>
+        <w:rPr>
+          <w:rStyle w:val="af"/>
+          <w:rFonts w:ascii="Arial" w:hAnsi="Arial" w:cs="Arial"/>
+          <w:sz w:val="21"/>
+          <w:szCs w:val="21"/>
+        </w:rPr>
+        <w:t>确定性的追寻与自我的安放</w:t>
+      </w:r>
+      <w:r>
+        <w:rPr>
+          <w:rFonts w:ascii="Arial" w:hAnsi="Arial" w:cs="Arial"/>
+          <w:sz w:val="21"/>
+          <w:szCs w:val="21"/>
+        </w:rPr>
+        <w:br/>
+      </w:r>
+      <w:r>
+        <w:rPr>
+          <w:rStyle w:val="af0"/>
+          <w:rFonts w:ascii="Arial" w:hAnsi="Arial" w:cs="Arial" w:hint="eastAsia"/>
+          <w:sz w:val="21"/>
+          <w:szCs w:val="21"/>
+        </w:rPr>
+        <w:t>“</w:t>
+      </w:r>
+      <w:r>
+        <w:rPr>
+          <w:rStyle w:val="af0"/>
+          <w:rFonts w:ascii="Arial" w:hAnsi="Arial" w:cs="Arial"/>
+          <w:sz w:val="21"/>
+          <w:szCs w:val="21"/>
+        </w:rPr>
+        <w:t>生活是自己选择的衣裳</w:t>
+      </w:r>
+      <w:r>
+        <w:rPr>
+          <w:rStyle w:val="af0"/>
+          <w:rFonts w:ascii="Arial" w:hAnsi="Arial" w:cs="Arial" w:hint="eastAsia"/>
+          <w:sz w:val="21"/>
+          <w:szCs w:val="21"/>
+        </w:rPr>
+        <w:t>”</w:t>
+      </w:r>
+      <w:r>
+        <w:rPr>
+          <w:rFonts w:ascii="Arial" w:hAnsi="Arial" w:cs="Arial"/>
+          <w:sz w:val="21"/>
+          <w:szCs w:val="21"/>
+        </w:rPr>
+        <w:br/>
+      </w:r>
+      <w:r>
+        <w:rPr>
+          <w:rFonts w:ascii="Arial" w:hAnsi="Arial" w:cs="Arial"/>
+          <w:sz w:val="21"/>
+          <w:szCs w:val="21"/>
+        </w:rPr>
+        <w:t>你拒绝将生命力折叠于内心，而是以入世的姿态主动拥抱外部的喧嚣。你深知个体的确证无法在虚无中获得，必须在与现实景观的碰撞中完成。你不惧怕被世俗规则裹挟，而是在充满张力的奔跑中，将外界转化为自我建构的养分，用纯粹的行动力，兑现出你所笃定的生活质感。</w:t>
+      </w:r>
+    </w:p>
+    <w:p>
+      <w:pPr>
         <w:spacing w:after="120"/>
         <w:outlineLvl w:val="2"/>
         <w:rPr>
@@ -7326,6 +7433,7 @@
           <w:sz w:val="27"/>
           <w:szCs w:val="27"/>
         </w:rPr>
+        <w:lastRenderedPageBreak/>
         <w:t>组态五：纯真防御与时间倒流机制</w:t>
       </w:r>
     </w:p>
@@ -7481,7 +7589,6 @@
           <w:color w:val="1F1F1F"/>
           <w:bdr w:val="none" w:sz="0" w:space="0" w:color="auto" w:frame="1"/>
         </w:rPr>
-        <w:lastRenderedPageBreak/>
         <w:t>《开始懂了》：认知升华与主权收回</w:t>
       </w:r>
     </w:p>
@@ -8008,7 +8115,7 @@
         <w:pStyle w:val="ae"/>
         <w:ind w:left="720"/>
         <w:rPr>
-          <w:rFonts w:ascii="Arial" w:hAnsi="Arial" w:cs="Arial" w:hint="eastAsia"/>
+          <w:rFonts w:ascii="Arial" w:hAnsi="Arial" w:cs="Arial"/>
           <w:i/>
           <w:iCs/>
           <w:color w:val="1F1F1F"/>
@@ -8023,6 +8130,7 @@
           <w:color w:val="1F1F1F"/>
           <w:bdr w:val="none" w:sz="0" w:space="0" w:color="auto" w:frame="1"/>
         </w:rPr>
+        <w:lastRenderedPageBreak/>
         <w:t>“</w:t>
       </w:r>
       <w:r>
@@ -8192,7 +8300,6 @@
           <w:rFonts w:ascii="Arial" w:hAnsi="Arial" w:cs="Arial"/>
           <w:color w:val="1F1F1F"/>
         </w:rPr>
-        <w:lastRenderedPageBreak/>
         <w:t>你将人生的阅历化作了一件兼顾防御与体面的风衣。你既不尖锐也不谄媚，与世界保持着最恰如其分的距离。你接受生命带来的所有风霜和磨损，并将它们视为赋予你自身独特质感的岁月纹理。这种</w:t>
       </w:r>
       <w:r>
@@ -12507,6 +12614,155 @@
     </w:lvl>
   </w:abstractNum>
   <w:abstractNum w:abstractNumId="28" w15:restartNumberingAfterBreak="0">
+    <w:nsid w:val="3C25246F"/>
+    <w:multiLevelType w:val="multilevel"/>
+    <w:tmpl w:val="FF8AD7CE"/>
+    <w:lvl w:ilvl="0">
+      <w:start w:val="1"/>
+      <w:numFmt w:val="bullet"/>
+      <w:lvlText w:val=""/>
+      <w:lvlJc w:val="left"/>
+      <w:pPr>
+        <w:tabs>
+          <w:tab w:val="num" w:pos="720"/>
+        </w:tabs>
+        <w:ind w:left="720" w:hanging="360"/>
+      </w:pPr>
+      <w:rPr>
+        <w:rFonts w:ascii="Symbol" w:hAnsi="Symbol" w:hint="default"/>
+        <w:sz w:val="20"/>
+      </w:rPr>
+    </w:lvl>
+    <w:lvl w:ilvl="1" w:tentative="1">
+      <w:start w:val="1"/>
+      <w:numFmt w:val="bullet"/>
+      <w:lvlText w:val="o"/>
+      <w:lvlJc w:val="left"/>
+      <w:pPr>
+        <w:tabs>
+          <w:tab w:val="num" w:pos="1440"/>
+        </w:tabs>
+        <w:ind w:left="1440" w:hanging="360"/>
+      </w:pPr>
+      <w:rPr>
+        <w:rFonts w:ascii="Courier New" w:hAnsi="Courier New" w:hint="default"/>
+        <w:sz w:val="20"/>
+      </w:rPr>
+    </w:lvl>
+    <w:lvl w:ilvl="2" w:tentative="1">
+      <w:start w:val="1"/>
+      <w:numFmt w:val="bullet"/>
+      <w:lvlText w:val=""/>
+      <w:lvlJc w:val="left"/>
+      <w:pPr>
+        <w:tabs>
+          <w:tab w:val="num" w:pos="2160"/>
+        </w:tabs>
+        <w:ind w:left="2160" w:hanging="360"/>
+      </w:pPr>
+      <w:rPr>
+        <w:rFonts w:ascii="Wingdings" w:hAnsi="Wingdings" w:hint="default"/>
+        <w:sz w:val="20"/>
+      </w:rPr>
+    </w:lvl>
+    <w:lvl w:ilvl="3" w:tentative="1">
+      <w:start w:val="1"/>
+      <w:numFmt w:val="bullet"/>
+      <w:lvlText w:val=""/>
+      <w:lvlJc w:val="left"/>
+      <w:pPr>
+        <w:tabs>
+          <w:tab w:val="num" w:pos="2880"/>
+        </w:tabs>
+        <w:ind w:left="2880" w:hanging="360"/>
+      </w:pPr>
+      <w:rPr>
+        <w:rFonts w:ascii="Wingdings" w:hAnsi="Wingdings" w:hint="default"/>
+        <w:sz w:val="20"/>
+      </w:rPr>
+    </w:lvl>
+    <w:lvl w:ilvl="4" w:tentative="1">
+      <w:start w:val="1"/>
+      <w:numFmt w:val="bullet"/>
+      <w:lvlText w:val=""/>
+      <w:lvlJc w:val="left"/>
+      <w:pPr>
+        <w:tabs>
+          <w:tab w:val="num" w:pos="3600"/>
+        </w:tabs>
+        <w:ind w:left="3600" w:hanging="360"/>
+      </w:pPr>
+      <w:rPr>
+        <w:rFonts w:ascii="Wingdings" w:hAnsi="Wingdings" w:hint="default"/>
+        <w:sz w:val="20"/>
+      </w:rPr>
+    </w:lvl>
+    <w:lvl w:ilvl="5" w:tentative="1">
+      <w:start w:val="1"/>
+      <w:numFmt w:val="bullet"/>
+      <w:lvlText w:val=""/>
+      <w:lvlJc w:val="left"/>
+      <w:pPr>
+        <w:tabs>
+          <w:tab w:val="num" w:pos="4320"/>
+        </w:tabs>
+        <w:ind w:left="4320" w:hanging="360"/>
+      </w:pPr>
+      <w:rPr>
+        <w:rFonts w:ascii="Wingdings" w:hAnsi="Wingdings" w:hint="default"/>
+        <w:sz w:val="20"/>
+      </w:rPr>
+    </w:lvl>
+    <w:lvl w:ilvl="6" w:tentative="1">
+      <w:start w:val="1"/>
+      <w:numFmt w:val="bullet"/>
+      <w:lvlText w:val=""/>
+      <w:lvlJc w:val="left"/>
+      <w:pPr>
+        <w:tabs>
+          <w:tab w:val="num" w:pos="5040"/>
+        </w:tabs>
+        <w:ind w:left="5040" w:hanging="360"/>
+      </w:pPr>
+      <w:rPr>
+        <w:rFonts w:ascii="Wingdings" w:hAnsi="Wingdings" w:hint="default"/>
+        <w:sz w:val="20"/>
+      </w:rPr>
+    </w:lvl>
+    <w:lvl w:ilvl="7" w:tentative="1">
+      <w:start w:val="1"/>
+      <w:numFmt w:val="bullet"/>
+      <w:lvlText w:val=""/>
+      <w:lvlJc w:val="left"/>
+      <w:pPr>
+        <w:tabs>
+          <w:tab w:val="num" w:pos="5760"/>
+        </w:tabs>
+        <w:ind w:left="5760" w:hanging="360"/>
+      </w:pPr>
+      <w:rPr>
+        <w:rFonts w:ascii="Wingdings" w:hAnsi="Wingdings" w:hint="default"/>
+        <w:sz w:val="20"/>
+      </w:rPr>
+    </w:lvl>
+    <w:lvl w:ilvl="8" w:tentative="1">
+      <w:start w:val="1"/>
+      <w:numFmt w:val="bullet"/>
+      <w:lvlText w:val=""/>
+      <w:lvlJc w:val="left"/>
+      <w:pPr>
+        <w:tabs>
+          <w:tab w:val="num" w:pos="6480"/>
+        </w:tabs>
+        <w:ind w:left="6480" w:hanging="360"/>
+      </w:pPr>
+      <w:rPr>
+        <w:rFonts w:ascii="Wingdings" w:hAnsi="Wingdings" w:hint="default"/>
+        <w:sz w:val="20"/>
+      </w:rPr>
+    </w:lvl>
+  </w:abstractNum>
+  <w:abstractNum w:abstractNumId="29" w15:restartNumberingAfterBreak="0">
     <w:nsid w:val="40BA5856"/>
     <w:multiLevelType w:val="multilevel"/>
     <w:tmpl w:val="26060AD6"/>
@@ -12655,7 +12911,7 @@
       </w:rPr>
     </w:lvl>
   </w:abstractNum>
-  <w:abstractNum w:abstractNumId="29" w15:restartNumberingAfterBreak="0">
+  <w:abstractNum w:abstractNumId="30" w15:restartNumberingAfterBreak="0">
     <w:nsid w:val="43F42AA7"/>
     <w:multiLevelType w:val="multilevel"/>
     <w:tmpl w:val="065C5EA4"/>
@@ -12804,7 +13060,7 @@
       </w:rPr>
     </w:lvl>
   </w:abstractNum>
-  <w:abstractNum w:abstractNumId="30" w15:restartNumberingAfterBreak="0">
+  <w:abstractNum w:abstractNumId="31" w15:restartNumberingAfterBreak="0">
     <w:nsid w:val="4556267D"/>
     <w:multiLevelType w:val="multilevel"/>
     <w:tmpl w:val="66486D8C"/>
@@ -12953,7 +13209,7 @@
       </w:rPr>
     </w:lvl>
   </w:abstractNum>
-  <w:abstractNum w:abstractNumId="31" w15:restartNumberingAfterBreak="0">
+  <w:abstractNum w:abstractNumId="32" w15:restartNumberingAfterBreak="0">
     <w:nsid w:val="45F172DB"/>
     <w:multiLevelType w:val="multilevel"/>
     <w:tmpl w:val="3190BF9E"/>
@@ -13102,7 +13358,7 @@
       </w:rPr>
     </w:lvl>
   </w:abstractNum>
-  <w:abstractNum w:abstractNumId="32" w15:restartNumberingAfterBreak="0">
+  <w:abstractNum w:abstractNumId="33" w15:restartNumberingAfterBreak="0">
     <w:nsid w:val="4A927F6E"/>
     <w:multiLevelType w:val="multilevel"/>
     <w:tmpl w:val="097C4A1E"/>
@@ -13251,7 +13507,7 @@
       </w:rPr>
     </w:lvl>
   </w:abstractNum>
-  <w:abstractNum w:abstractNumId="33" w15:restartNumberingAfterBreak="0">
+  <w:abstractNum w:abstractNumId="34" w15:restartNumberingAfterBreak="0">
     <w:nsid w:val="4B0C4C44"/>
     <w:multiLevelType w:val="multilevel"/>
     <w:tmpl w:val="3D44C186"/>
@@ -13400,7 +13656,7 @@
       </w:rPr>
     </w:lvl>
   </w:abstractNum>
-  <w:abstractNum w:abstractNumId="34" w15:restartNumberingAfterBreak="0">
+  <w:abstractNum w:abstractNumId="35" w15:restartNumberingAfterBreak="0">
     <w:nsid w:val="55EF6A98"/>
     <w:multiLevelType w:val="multilevel"/>
     <w:tmpl w:val="33DCF466"/>
@@ -13549,7 +13805,7 @@
       </w:rPr>
     </w:lvl>
   </w:abstractNum>
-  <w:abstractNum w:abstractNumId="35" w15:restartNumberingAfterBreak="0">
+  <w:abstractNum w:abstractNumId="36" w15:restartNumberingAfterBreak="0">
     <w:nsid w:val="565B2C4A"/>
     <w:multiLevelType w:val="multilevel"/>
     <w:tmpl w:val="94E6CA26"/>
@@ -13698,7 +13954,7 @@
       </w:rPr>
     </w:lvl>
   </w:abstractNum>
-  <w:abstractNum w:abstractNumId="36" w15:restartNumberingAfterBreak="0">
+  <w:abstractNum w:abstractNumId="37" w15:restartNumberingAfterBreak="0">
     <w:nsid w:val="58935327"/>
     <w:multiLevelType w:val="multilevel"/>
     <w:tmpl w:val="8550C518"/>
@@ -13847,7 +14103,7 @@
       </w:rPr>
     </w:lvl>
   </w:abstractNum>
-  <w:abstractNum w:abstractNumId="37" w15:restartNumberingAfterBreak="0">
+  <w:abstractNum w:abstractNumId="38" w15:restartNumberingAfterBreak="0">
     <w:nsid w:val="5A54123E"/>
     <w:multiLevelType w:val="multilevel"/>
     <w:tmpl w:val="0BAE6A4C"/>
@@ -13996,7 +14252,7 @@
       </w:rPr>
     </w:lvl>
   </w:abstractNum>
-  <w:abstractNum w:abstractNumId="38" w15:restartNumberingAfterBreak="0">
+  <w:abstractNum w:abstractNumId="39" w15:restartNumberingAfterBreak="0">
     <w:nsid w:val="62B57D49"/>
     <w:multiLevelType w:val="multilevel"/>
     <w:tmpl w:val="71A2D122"/>
@@ -14145,7 +14401,7 @@
       </w:rPr>
     </w:lvl>
   </w:abstractNum>
-  <w:abstractNum w:abstractNumId="39" w15:restartNumberingAfterBreak="0">
+  <w:abstractNum w:abstractNumId="40" w15:restartNumberingAfterBreak="0">
     <w:nsid w:val="65E01D16"/>
     <w:multiLevelType w:val="multilevel"/>
     <w:tmpl w:val="124438CA"/>
@@ -14294,7 +14550,7 @@
       </w:rPr>
     </w:lvl>
   </w:abstractNum>
-  <w:abstractNum w:abstractNumId="40" w15:restartNumberingAfterBreak="0">
+  <w:abstractNum w:abstractNumId="41" w15:restartNumberingAfterBreak="0">
     <w:nsid w:val="6C706445"/>
     <w:multiLevelType w:val="multilevel"/>
     <w:tmpl w:val="044AEB38"/>
@@ -14443,7 +14699,7 @@
       </w:rPr>
     </w:lvl>
   </w:abstractNum>
-  <w:abstractNum w:abstractNumId="41" w15:restartNumberingAfterBreak="0">
+  <w:abstractNum w:abstractNumId="42" w15:restartNumberingAfterBreak="0">
     <w:nsid w:val="6E101AF6"/>
     <w:multiLevelType w:val="multilevel"/>
     <w:tmpl w:val="1F9C0A56"/>
@@ -14592,7 +14848,7 @@
       </w:rPr>
     </w:lvl>
   </w:abstractNum>
-  <w:abstractNum w:abstractNumId="42" w15:restartNumberingAfterBreak="0">
+  <w:abstractNum w:abstractNumId="43" w15:restartNumberingAfterBreak="0">
     <w:nsid w:val="750F0184"/>
     <w:multiLevelType w:val="multilevel"/>
     <w:tmpl w:val="B03CA542"/>
@@ -14741,7 +14997,7 @@
       </w:rPr>
     </w:lvl>
   </w:abstractNum>
-  <w:abstractNum w:abstractNumId="43" w15:restartNumberingAfterBreak="0">
+  <w:abstractNum w:abstractNumId="44" w15:restartNumberingAfterBreak="0">
     <w:nsid w:val="7A846860"/>
     <w:multiLevelType w:val="multilevel"/>
     <w:tmpl w:val="F834A7C6"/>
@@ -14890,7 +15146,7 @@
       </w:rPr>
     </w:lvl>
   </w:abstractNum>
-  <w:abstractNum w:abstractNumId="44" w15:restartNumberingAfterBreak="0">
+  <w:abstractNum w:abstractNumId="45" w15:restartNumberingAfterBreak="0">
     <w:nsid w:val="7F873DFE"/>
     <w:multiLevelType w:val="multilevel"/>
     <w:tmpl w:val="E90ABF2A"/>
@@ -15049,16 +15305,16 @@
     <w:abstractNumId w:val="0"/>
   </w:num>
   <w:num w:numId="4" w16cid:durableId="2033648732">
-    <w:abstractNumId w:val="43"/>
+    <w:abstractNumId w:val="44"/>
   </w:num>
   <w:num w:numId="5" w16cid:durableId="1874422626">
     <w:abstractNumId w:val="8"/>
   </w:num>
   <w:num w:numId="6" w16cid:durableId="2066491879">
-    <w:abstractNumId w:val="41"/>
+    <w:abstractNumId w:val="42"/>
   </w:num>
   <w:num w:numId="7" w16cid:durableId="1455051861">
-    <w:abstractNumId w:val="32"/>
+    <w:abstractNumId w:val="33"/>
   </w:num>
   <w:num w:numId="8" w16cid:durableId="1766148331">
     <w:abstractNumId w:val="1"/>
@@ -15076,22 +15332,22 @@
     <w:abstractNumId w:val="2"/>
   </w:num>
   <w:num w:numId="13" w16cid:durableId="404692189">
-    <w:abstractNumId w:val="29"/>
+    <w:abstractNumId w:val="30"/>
   </w:num>
   <w:num w:numId="14" w16cid:durableId="701398569">
-    <w:abstractNumId w:val="44"/>
+    <w:abstractNumId w:val="45"/>
   </w:num>
   <w:num w:numId="15" w16cid:durableId="289018056">
-    <w:abstractNumId w:val="28"/>
+    <w:abstractNumId w:val="29"/>
   </w:num>
   <w:num w:numId="16" w16cid:durableId="427312958">
     <w:abstractNumId w:val="9"/>
   </w:num>
   <w:num w:numId="17" w16cid:durableId="1734082669">
-    <w:abstractNumId w:val="35"/>
+    <w:abstractNumId w:val="36"/>
   </w:num>
   <w:num w:numId="18" w16cid:durableId="822509550">
-    <w:abstractNumId w:val="42"/>
+    <w:abstractNumId w:val="43"/>
   </w:num>
   <w:num w:numId="19" w16cid:durableId="1138718848">
     <w:abstractNumId w:val="11"/>
@@ -15100,13 +15356,13 @@
     <w:abstractNumId w:val="13"/>
   </w:num>
   <w:num w:numId="21" w16cid:durableId="1462573345">
-    <w:abstractNumId w:val="34"/>
+    <w:abstractNumId w:val="35"/>
   </w:num>
   <w:num w:numId="22" w16cid:durableId="1441680324">
     <w:abstractNumId w:val="20"/>
   </w:num>
   <w:num w:numId="23" w16cid:durableId="1237351522">
-    <w:abstractNumId w:val="38"/>
+    <w:abstractNumId w:val="39"/>
   </w:num>
   <w:num w:numId="24" w16cid:durableId="41489169">
     <w:abstractNumId w:val="12"/>
@@ -15115,19 +15371,19 @@
     <w:abstractNumId w:val="14"/>
   </w:num>
   <w:num w:numId="26" w16cid:durableId="1619725874">
-    <w:abstractNumId w:val="31"/>
+    <w:abstractNumId w:val="32"/>
   </w:num>
   <w:num w:numId="27" w16cid:durableId="224879431">
-    <w:abstractNumId w:val="30"/>
+    <w:abstractNumId w:val="31"/>
   </w:num>
   <w:num w:numId="28" w16cid:durableId="3288632">
     <w:abstractNumId w:val="25"/>
   </w:num>
   <w:num w:numId="29" w16cid:durableId="1864710302">
-    <w:abstractNumId w:val="36"/>
+    <w:abstractNumId w:val="37"/>
   </w:num>
   <w:num w:numId="30" w16cid:durableId="1666084188">
-    <w:abstractNumId w:val="33"/>
+    <w:abstractNumId w:val="34"/>
   </w:num>
   <w:num w:numId="31" w16cid:durableId="1569878665">
     <w:abstractNumId w:val="27"/>
@@ -15139,7 +15395,7 @@
     <w:abstractNumId w:val="15"/>
   </w:num>
   <w:num w:numId="34" w16cid:durableId="776876632">
-    <w:abstractNumId w:val="40"/>
+    <w:abstractNumId w:val="41"/>
   </w:num>
   <w:num w:numId="35" w16cid:durableId="408237689">
     <w:abstractNumId w:val="17"/>
@@ -15151,10 +15407,10 @@
     <w:abstractNumId w:val="7"/>
   </w:num>
   <w:num w:numId="38" w16cid:durableId="908155361">
-    <w:abstractNumId w:val="37"/>
+    <w:abstractNumId w:val="38"/>
   </w:num>
   <w:num w:numId="39" w16cid:durableId="2128347867">
-    <w:abstractNumId w:val="39"/>
+    <w:abstractNumId w:val="40"/>
   </w:num>
   <w:num w:numId="40" w16cid:durableId="1091004753">
     <w:abstractNumId w:val="26"/>
@@ -15173,6 +15429,9 @@
   </w:num>
   <w:num w:numId="45" w16cid:durableId="872770466">
     <w:abstractNumId w:val="5"/>
+  </w:num>
+  <w:num w:numId="46" w16cid:durableId="1466502351">
+    <w:abstractNumId w:val="28"/>
   </w:num>
 </w:numbering>
 </file>
@@ -15573,7 +15832,7 @@
   <w:style w:type="paragraph" w:default="1" w:styleId="a">
     <w:name w:val="Normal"/>
     <w:qFormat/>
-    <w:rsid w:val="00553FAE"/>
+    <w:rsid w:val="00E62C93"/>
     <w:rPr>
       <w:rFonts w:ascii="宋体" w:eastAsia="宋体" w:hAnsi="宋体" w:cs="宋体"/>
       <w:kern w:val="0"/>
@@ -16110,6 +16369,28 @@
     <w:basedOn w:val="a0"/>
     <w:rsid w:val="003E6CDF"/>
   </w:style>
+  <w:style w:type="character" w:styleId="af">
+    <w:name w:val="Strong"/>
+    <w:basedOn w:val="a0"/>
+    <w:uiPriority w:val="22"/>
+    <w:qFormat/>
+    <w:rsid w:val="00E62C93"/>
+    <w:rPr>
+      <w:b/>
+      <w:bCs/>
+    </w:rPr>
+  </w:style>
+  <w:style w:type="character" w:styleId="af0">
+    <w:name w:val="Emphasis"/>
+    <w:basedOn w:val="a0"/>
+    <w:uiPriority w:val="20"/>
+    <w:qFormat/>
+    <w:rsid w:val="00E62C93"/>
+    <w:rPr>
+      <w:i/>
+      <w:iCs/>
+    </w:rPr>
+  </w:style>
 </w:styles>
 </file>
 

</xml_diff>